<commit_message>
Update flag raising guide documents
</commit_message>
<xml_diff>
--- a/升旗规划推算与使用说明.docx
+++ b/升旗规划推算与使用说明.docx
@@ -15,36 +15,7 @@
     </w:p>
     <w:p>
       <w:r>
-        <w:rPr>
-          <w:rFonts w:ascii="STHeiti" w:hAnsi="STHeiti" w:eastAsia="STHeiti"/>
-        </w:rPr>
-        <w:t xml:space="preserve">本说明对应项目当前的 </w:t>
-      </w:r>
-      <w:r>
-        <w:rPr>
-          <w:rFonts w:ascii="STHeiti" w:hAnsi="STHeiti" w:eastAsia="STHeiti"/>
-          <w:color w:val="1E574C"/>
-        </w:rPr>
-        <w:t>index.html</w:t>
-      </w:r>
-      <w:r>
-        <w:rPr>
-          <w:rFonts w:ascii="STHeiti" w:hAnsi="STHeiti" w:eastAsia="STHeiti"/>
-        </w:rPr>
-        <w:t>、</w:t>
-      </w:r>
-      <w:r>
-        <w:rPr>
-          <w:rFonts w:ascii="STHeiti" w:hAnsi="STHeiti" w:eastAsia="STHeiti"/>
-          <w:color w:val="1E574C"/>
-        </w:rPr>
-        <w:t>script.js</w:t>
-      </w:r>
-      <w:r>
-        <w:rPr>
-          <w:rFonts w:ascii="STHeiti" w:hAnsi="STHeiti" w:eastAsia="STHeiti"/>
-        </w:rPr>
-        <w:t xml:space="preserve"> 与两段音频。模拟分为国歌升国旗、校歌升两面校旗两个环节：国旗规划 60 圈，校旗规划 52 圈。点击播放后音乐立即开始，旗帜等各自前奏结束才升起；升旗终点与项目设定的可听尾音终点对齐。页面用于教学与手摇节奏练习，现场应以实测旗杆、滑轮和音响设备再校准。</w:t>
+        <w:t>本说明对应项目当前的 index.html、script.js、styles.css、visual.css 与两段音频。模拟分为国歌升国旗、校歌升两面校旗两个环节：国旗规划 60 圈，校旗规划 52 圈。点击播放后音乐立即开始，旗帜等各自前奏结束才升起；升旗终点与项目设定的可听尾音终点对齐。页面用于教学与手摇节奏练习，现场应以实测旗杆、滑轮和音响设备再校准。在线地址：https://flag-raise-ceremony-guide.ccwu.cc/。</w:t>
       </w:r>
     </w:p>
     <w:p>
@@ -1273,6 +1244,40 @@
     </w:p>
     <w:p>
       <w:pPr>
+        <w:pStyle w:val="Heading2"/>
+      </w:pPr>
+      <w:r>
+        <w:t>旗帜位置与校旗示意模型</w:t>
+      </w:r>
+    </w:p>
+    <w:p>
+      <w:pPr/>
+      <w:r>
+        <w:t>三面旗帜的高度只随当前环节的升旗进度改变；旗面不再进行循环位移或形变动画。国歌环节的中央国旗在前奏期间保持杆底，随后按国旗进度升起，左右校旗始终保持杆底。校歌环节中央国旗保持杆顶，左右校旗由同一个进度值同步升起，不会各自漂移。切换环节、拖动进度条、重置或到达终点时，画面会依照所选时间和环节重新定位旗帜，这是预期行为。</w:t>
+      </w:r>
+    </w:p>
+    <w:p>
+      <w:pPr/>
+      <w:r>
+        <w:t>校旗使用绿色旗面、圆形徽记及抽象书本图形，旗面标有“校旗示意”。这是供规划演示的示意模型，并非学校正式校旗；取得正式校旗图样后可替换图形，而不必改变升旗时间和圈数算法。</w:t>
+      </w:r>
+    </w:p>
+    <w:p>
+      <w:pPr>
+        <w:pStyle w:val="Heading2"/>
+      </w:pPr>
+      <w:r>
+        <w:t>页面底部的节拍器读数</w:t>
+      </w:r>
+    </w:p>
+    <w:p>
+      <w:pPr/>
+      <w:r>
+        <w:t>页面底部同时显示国旗和校旗两张节拍器卡片，卡片旁有节拍器图标。国旗卡片显示目标速度 88.65 次/分及“当前提示 / 60”；国旗每圈起点提示一次。校旗卡片显示 99.36 拍/分、对应的 49.68 圈/分及“当前节拍 / 104”；校旗每圈包含主拍和半圈小拍。读数随现有音频与提示进度更新，仅用于显示，不改变原有升旗计算和播放规则。</w:t>
+      </w:r>
+    </w:p>
+    <w:p>
+      <w:pPr>
         <w:pStyle w:val="Heading1"/>
       </w:pPr>
       <w:r>
@@ -1288,36 +1293,7 @@
         <w:spacing w:after="80"/>
       </w:pPr>
       <w:r>
-        <w:rPr>
-          <w:rFonts w:ascii="STHeiti" w:hAnsi="STHeiti" w:eastAsia="STHeiti"/>
-        </w:rPr>
-        <w:t xml:space="preserve">打开项目文件夹中的 </w:t>
-      </w:r>
-      <w:r>
-        <w:rPr>
-          <w:rFonts w:ascii="STHeiti" w:hAnsi="STHeiti" w:eastAsia="STHeiti"/>
-          <w:color w:val="1E574C"/>
-        </w:rPr>
-        <w:t>index.html</w:t>
-      </w:r>
-      <w:r>
-        <w:rPr>
-          <w:rFonts w:ascii="STHeiti" w:hAnsi="STHeiti" w:eastAsia="STHeiti"/>
-        </w:rPr>
-        <w:t>。页面是本地静态网页，双击打开即可；</w:t>
-      </w:r>
-      <w:r>
-        <w:rPr>
-          <w:rFonts w:ascii="STHeiti" w:hAnsi="STHeiti" w:eastAsia="STHeiti"/>
-          <w:color w:val="1E574C"/>
-        </w:rPr>
-        <w:t>assets</w:t>
-      </w:r>
-      <w:r>
-        <w:rPr>
-          <w:rFonts w:ascii="STHeiti" w:hAnsi="STHeiti" w:eastAsia="STHeiti"/>
-        </w:rPr>
-        <w:t xml:space="preserve"> 文件夹须和页面保持原有相对位置，音乐才能加载。</w:t>
+        <w:t>访问在线页面 https://flag-raise-ceremony-guide.ccwu.cc/，或打开项目文件夹中的 index.html。本地版双击即可运行；assets 文件夹须和页面保持原有相对位置，音乐才能加载。</w:t>
       </w:r>
     </w:p>
     <w:p>
@@ -1414,10 +1390,7 @@
         <w:spacing w:after="80"/>
       </w:pPr>
       <w:r>
-        <w:rPr>
-          <w:rFonts w:ascii="STHeiti" w:hAnsi="STHeiti" w:eastAsia="STHeiti"/>
-        </w:rPr>
-        <w:t>看控制台的“目标圈数”“手摇圈数”和领先或落后提示来校正速度。校歌的 104 个拍点中，较大的主拍提示新一圈开始，较轻的小拍提示半圈位置。</w:t>
+        <w:t>看控制台的“目标圈数”“手摇圈数”和领先或落后提示来校正速度；页面底部的节拍器卡片可核对目标速度与当前提示。校歌的 104 个拍点中，较大的主拍提示新一圈开始，较轻的小拍提示半圈位置。</w:t>
       </w:r>
     </w:p>
     <w:p>
@@ -1795,6 +1768,22 @@
     <w:p>
       <w:pPr>
         <w:pStyle w:val="ListBullet"/>
+      </w:pPr>
+      <w:r>
+        <w:t>切换环节后国旗位置改变：国歌环节国旗从杆底开始；校歌环节国旗按流程固定在杆顶。切换环节或拖动进度条会重新定位画面，正常播放时旗帜只随对应升旗进度移动。</w:t>
+      </w:r>
+    </w:p>
+    <w:p>
+      <w:pPr>
+        <w:pStyle w:val="ListBullet"/>
+      </w:pPr>
+      <w:r>
+        <w:t>页面里的校旗是否为正式校旗：不是。绿色旗面和书本徽记仅用于示意，正式使用前应按学校确认的校旗图样替换。</w:t>
+      </w:r>
+    </w:p>
+    <w:p>
+      <w:pPr>
+        <w:pStyle w:val="ListBullet"/>
         <w:spacing w:after="60"/>
       </w:pPr>
       <w:r>
@@ -1968,17 +1957,15 @@
         <w:spacing w:after="60"/>
       </w:pPr>
       <w:r>
-        <w:rPr>
-          <w:rFonts w:ascii="STHeiti" w:hAnsi="STHeiti" w:eastAsia="STHeiti"/>
-          <w:color w:val="1E574C"/>
-        </w:rPr>
-        <w:t>styles.css</w:t>
+        <w:t>styles.css：基础页面与操作控件样式。</w:t>
       </w:r>
+    </w:p>
+    <w:p>
+      <w:pPr>
+        <w:pStyle w:val="ListBullet"/>
+      </w:pPr>
       <w:r>
-        <w:rPr>
-          <w:rFonts w:ascii="STHeiti" w:hAnsi="STHeiti" w:eastAsia="STHeiti"/>
-        </w:rPr>
-        <w:t>：页面及节拍格样式。</w:t>
+        <w:t>visual.css：场景布局、旗帜示意、底部节拍器卡片及响应式视觉样式。</w:t>
       </w:r>
     </w:p>
     <w:p>
@@ -2788,7 +2775,7 @@
       <w:color w:val="000000"/>
       <w:spacing w:val="5"/>
       <w:kern w:val="28"/>
-      <w:sz w:val="38"/>
+      <w:sz w:val="36"/>
       <w:szCs w:val="52"/>
     </w:rPr>
   </w:style>

</xml_diff>